<commit_message>
Mention the preparation step and the longer completion time in letters and forms
Co-Authored-By: Claude Fable 5.1 <noreply@anthropic.com>
</commit_message>
<xml_diff>
--- a/PREDICT_fogtechnikus_prior_urlap.docx
+++ b/PREDICT_fogtechnikus_prior_urlap.docx
@@ -381,7 +381,7 @@
           <w:b w:val="0"/>
           <w:i w:val="0"/>
         </w:rPr>
-        <w:t>Nincs jó vagy rossz válasz. Nem a tankönyvre, hanem az Ön saját, a munkája során szerzett tapasztalatára vagyunk kíváncsiak, akkor is, ha az eltér a tanultaktól. Ha valamit a mintáról, a laborból nem lehet megítélni, jelölje azt, ne találgasson: az is fontos információ. A kitöltés körülbelül 25–35 perc.</w:t>
+        <w:t>Nincs jó vagy rossz válasz. Nem a tankönyvre, hanem az Ön saját, a munkája során szerzett tapasztalatára vagyunk kíváncsiak, akkor is, ha az eltér a tanultaktól. Ha valamit a mintáról, a laborból nem lehet megítélni, jelölje azt, ne találgasson: az is fontos információ. A kitöltés körülbelül 35–45 perc.</w:t>
       </w:r>
     </w:p>
     <w:p>
@@ -611,7 +611,7 @@
           <w:b w:val="0"/>
           <w:i w:val="0"/>
         </w:rPr>
-        <w:t>Adottság: a felső gerinc magassága. A kolléga szerint az alacsony gerinc a rosszabb, és ebben 90 %-ig biztos. Száz magas gerincű betegből szerinte 85-nek lesz sikeres a fogsora; a valódi arány szerinte legalább 75, legfeljebb 92 lehet. Száz alacsony gerincűből 60-nak; legalább 45, legfeljebb 72. A legvalószínűbb számok tehát 85 és 60, a sávok pedig azt mutatják, mennyire biztos a két aránybban.</w:t>
+        <w:t>Adottság: a felső gerinc magassága. A kolléga szerint az alacsony gerinc a rosszabb, és ebben 90 %-ig biztos. Száz magas gerincű betegből szerinte 85-nek lesz sikeres a fogsora; a valódi arány szerinte legalább 75, legfeljebb 92 lehet. Száz alacsony gerincűből 60-nak; legalább 45, legfeljebb 72. A legvalószínűbb számok tehát 85 és 60, a sávok pedig azt mutatják, mennyire biztos a két arányban.</w:t>
       </w:r>
     </w:p>
     <w:p>

</xml_diff>